<commit_message>
Fix gender agreement for Arabic role and section labels
- Feminize Arabic role (منسقة) for female participants
- Apply Male/Female Section in English based on gender column
- Regenerated all 28 certificates with corrected gender forms

https://claude.ai/code/session_01XbHfH1b8kg1rYEG4wXTtxY
</commit_message>
<xml_diff>
--- a/certificates/أميرة_عبدالله_محمد_بن_رابح.docx
+++ b/certificates/أميرة_عبدالله_محمد_بن_رابح.docx
@@ -1039,7 +1039,7 @@
                                 <w:szCs w:val="28"/>
                                 <w14:ligatures w14:val="none"/>
                               </w:rPr>
-                              <w:t>منسق فرع</w:t>
+                              <w:t>منسقة فرع</w:t>
                             </w:r>
                             <w:r>
                               <w:rPr>
@@ -1308,7 +1308,7 @@
                           <w:szCs w:val="28"/>
                           <w14:ligatures w14:val="none"/>
                         </w:rPr>
-                        <w:t>منسق فرع</w:t>
+                        <w:t>منسقة فرع</w:t>
                       </w:r>
                       <w:r>
                         <w:rPr>

</xml_diff>

<commit_message>
Add dynamic center name and gender-correct section to certificates
- Read center name from Excel col A; insert into Arabic and English text
- If center is empty, omit the center phrase entirely
- Map Arabic city names to English equivalents
- Apply لشطر الطلاب/الطالبات based on gender

https://claude.ai/code/session_01XbHfH1b8kg1rYEG4wXTtxY
</commit_message>
<xml_diff>
--- a/certificates/أميرة_عبدالله_محمد_بن_رابح.docx
+++ b/certificates/أميرة_عبدالله_محمد_بن_رابح.docx
@@ -1051,7 +1051,7 @@
                                 <w:rtl/>
                                 <w14:ligatures w14:val="none"/>
                               </w:rPr>
-                              <w:t xml:space="preserve"> بالمركز التعليمي بجدة لشطر الطالبات خلال العام الجامعي ١٤٤٧ هـ</w:t>
+                              <w:t xml:space="preserve"> بالمركز التعليمي بحائل لشطر الطالبات خلال العام الجامعي ١٤٤٧ هـ</w:t>
                             </w:r>
                           </w:p>
                           <w:p>
@@ -1320,7 +1320,7 @@
                           <w:rtl/>
                           <w14:ligatures w14:val="none"/>
                         </w:rPr>
-                        <w:t xml:space="preserve"> بالمركز التعليمي بجدة لشطر الطالبات خلال العام الجامعي ١٤٤٧ هـ</w:t>
+                        <w:t xml:space="preserve"> بالمركز التعليمي بحائل لشطر الطالبات خلال العام الجامعي ١٤٤٧ هـ</w:t>
                       </w:r>
                     </w:p>
                     <w:p>
@@ -1499,7 +1499,7 @@
                                 <w:sz w:val="28"/>
                                 <w:szCs w:val="28"/>
                               </w:rPr>
-                              <w:t xml:space="preserve"> at the Jeddah Educational Center, Female Section, during the academic year 1447 AH.</w:t>
+                              <w:t xml:space="preserve"> at the Hail Educational Center, Female Section, during the academic year 1447 AH.</w:t>
                             </w:r>
                           </w:p>
                           <w:p>
@@ -1638,7 +1638,7 @@
                           <w:sz w:val="28"/>
                           <w:szCs w:val="28"/>
                         </w:rPr>
-                        <w:t xml:space="preserve"> at the Jeddah Educational Center, Female Section, during the academic year 1447 AH.</w:t>
+                        <w:t xml:space="preserve"> at the Hail Educational Center, Female Section, during the academic year 1447 AH.</w:t>
                       </w:r>
                     </w:p>
                     <w:p>

</xml_diff>

<commit_message>
Improve PDF rendering and fix كمنسق/كمنسقة connection
- Replace mammoth+weasyprint PDF with PIL image-based renderer
  for pixel-accurate output matching the Word certificate design
- Connect ك prefix directly to role word (كمنسق/كمنسقة)
- Render Arabic text with NotoNaskhArabic font via arabic-reshaper/bidi
- Overlay text on certificate background image, export via img2pdf

https://claude.ai/code/session_01XbHfH1b8kg1rYEG4wXTtxY
</commit_message>
<xml_diff>
--- a/certificates/أميرة_عبدالله_محمد_بن_رابح.docx
+++ b/certificates/أميرة_عبدالله_محمد_بن_رابح.docx
@@ -1016,7 +1016,7 @@
                                 <w:rtl/>
                                 <w14:ligatures w14:val="none"/>
                               </w:rPr>
-                              <w:t xml:space="preserve"> ك</w:t>
+                              <w:t/>
                             </w:r>
                             <w:r>
                               <w:rPr>
@@ -1039,7 +1039,7 @@
                                 <w:szCs w:val="28"/>
                                 <w14:ligatures w14:val="none"/>
                               </w:rPr>
-                              <w:t>منسقة فرع</w:t>
+                              <w:t>كمنسقة فرع</w:t>
                             </w:r>
                             <w:r>
                               <w:rPr>
@@ -1285,7 +1285,7 @@
                           <w:rtl/>
                           <w14:ligatures w14:val="none"/>
                         </w:rPr>
-                        <w:t xml:space="preserve"> ك</w:t>
+                        <w:t/>
                       </w:r>
                       <w:r>
                         <w:rPr>
@@ -1308,7 +1308,7 @@
                           <w:szCs w:val="28"/>
                           <w14:ligatures w14:val="none"/>
                         </w:rPr>
-                        <w:t>منسقة فرع</w:t>
+                        <w:t>كمنسقة فرع</w:t>
                       </w:r>
                       <w:r>
                         <w:rPr>

</xml_diff>

<commit_message>
Switch to new template and fix كمنسق/كمنسقة spacing
- Update TEMPLATE path to new certificate design
- Remove space between ك and role word (كمنسق/كمنسقة)
- Fix center text replacement to match new template's text nodes

https://claude.ai/code/session_01XbHfH1b8kg1rYEG4wXTtxY
</commit_message>
<xml_diff>
--- a/certificates/أميرة_عبدالله_محمد_بن_رابح.docx
+++ b/certificates/أميرة_عبدالله_محمد_بن_رابح.docx
@@ -721,7 +721,7 @@
                                     <pic:cNvPicPr/>
                                   </pic:nvPicPr>
                                   <pic:blipFill>
-                                    <a:blip r:embed="rId6" cstate="print"/>
+                                    <a:blip r:embed="rId7" cstate="print"/>
                                     <a:stretch>
                                       <a:fillRect/>
                                     </a:stretch>
@@ -1051,7 +1051,67 @@
                                 <w:rtl/>
                                 <w14:ligatures w14:val="none"/>
                               </w:rPr>
-                              <w:t xml:space="preserve"> بالمركز التعليمي بحائل لشطر الطالبات خلال العام الجامعي ١٤٤٧ هـ</w:t>
+                              <w:t xml:space="preserve"> </w:t>
+                            </w:r>
+                            <w:r>
+                              <w:rPr>
+                                <w:rFonts w:ascii="Frutiger LT Arabic 45 Light" w:eastAsia="Times New Roman" w:hAnsi="Frutiger LT Arabic 45 Light" w:cs="Frutiger LT Arabic 45 Light" w:hint="cs"/>
+                                <w:color w:val="156082" w:themeColor="accent1"/>
+                                <w:kern w:val="0"/>
+                                <w:sz w:val="28"/>
+                                <w:szCs w:val="28"/>
+                                <w:rtl/>
+                                <w14:ligatures w14:val="none"/>
+                              </w:rPr>
+                              <w:t>لكلية الحوسبة</w:t>
+                            </w:r>
+                            <w:r>
+                              <w:rPr>
+                                <w:rFonts w:ascii="Frutiger LT Arabic 45 Light" w:eastAsia="Times New Roman" w:hAnsi="Frutiger LT Arabic 45 Light" w:cs="Frutiger LT Arabic 45 Light" w:hint="cs"/>
+                                <w:color w:val="156082" w:themeColor="accent1"/>
+                                <w:kern w:val="0"/>
+                                <w:sz w:val="28"/>
+                                <w:szCs w:val="28"/>
+                                <w:rtl/>
+                                <w14:ligatures w14:val="none"/>
+                              </w:rPr>
+                              <w:t xml:space="preserve"> </w:t>
+                            </w:r>
+                            <w:r>
+                              <w:rPr>
+                                <w:rFonts w:ascii="Frutiger LT Arabic 45 Light" w:eastAsia="Times New Roman" w:hAnsi="Frutiger LT Arabic 45 Light" w:cs="Frutiger LT Arabic 45 Light" w:hint="cs"/>
+                                <w:color w:val="156082" w:themeColor="accent1"/>
+                                <w:kern w:val="0"/>
+                                <w:sz w:val="28"/>
+                                <w:szCs w:val="28"/>
+                                <w:rtl/>
+                                <w14:ligatures w14:val="none"/>
+                              </w:rPr>
+                              <w:t>والمعلوماتية</w:t>
+                            </w:r>
+                            <w:r>
+                              <w:rPr>
+                                <w:rFonts w:ascii="Frutiger LT Arabic 45 Light" w:eastAsia="Times New Roman" w:hAnsi="Frutiger LT Arabic 45 Light" w:cs="Frutiger LT Arabic 45 Light" w:hint="cs"/>
+                                <w:color w:val="156082" w:themeColor="accent1"/>
+                                <w:kern w:val="0"/>
+                                <w:sz w:val="28"/>
+                                <w:szCs w:val="28"/>
+                                <w:rtl/>
+                                <w14:ligatures w14:val="none"/>
+                              </w:rPr>
+                              <w:t xml:space="preserve"> </w:t>
+                            </w:r>
+                            <w:r>
+                              <w:rPr>
+                                <w:rFonts w:ascii="Frutiger LT Arabic 45 Light" w:eastAsia="Times New Roman" w:hAnsi="Frutiger LT Arabic 45 Light" w:cs="Frutiger LT Arabic 45 Light" w:hint="cs"/>
+                                <w:color w:val="156082" w:themeColor="accent1"/>
+                                <w:kern w:val="0"/>
+                                <w:sz w:val="28"/>
+                                <w:szCs w:val="28"/>
+                                <w:rtl/>
+                                <w14:ligatures w14:val="none"/>
+                              </w:rPr>
+                              <w:t>بالمركز التعليمي بحائل لشطر الطالبات خلال العام الجامعي ١٤٤٧ هـ</w:t>
                             </w:r>
                           </w:p>
                           <w:p>
@@ -1118,7 +1178,11 @@
           </mc:Choice>
           <mc:Fallback>
             <w:pict>
-              <v:shape w14:anchorId="4BEF5500" id="_x0000_s1028" type="#_x0000_t202" style="position:absolute;left:0;text-align:left;margin-left:358.75pt;margin-top:165.2pt;width:373.6pt;height:249.5pt;z-index:251664384;visibility:visible;mso-wrap-style:square;mso-width-percent:0;mso-height-percent:0;mso-wrap-distance-left:9pt;mso-wrap-distance-top:0;mso-wrap-distance-right:9pt;mso-wrap-distance-bottom:0;mso-position-horizontal:absolute;mso-position-horizontal-relative:margin;mso-position-vertical:absolute;mso-position-vertical-relative:text;mso-width-percent:0;mso-height-percent:0;mso-width-relative:margin;mso-height-relative:margin;v-text-anchor:top" o:gfxdata="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" filled="f" stroked="f" strokeweight=".5pt">
+              <v:shapetype w14:anchorId="4BEF5500" id="_x0000_t202" coordsize="21600,21600" o:spt="202" path="m,l,21600r21600,l21600,xe">
+                <v:stroke joinstyle="miter"/>
+                <v:path gradientshapeok="t" o:connecttype="rect"/>
+              </v:shapetype>
+              <v:shape id="_x0000_s1028" type="#_x0000_t202" style="position:absolute;left:0;text-align:left;margin-left:358.75pt;margin-top:165.2pt;width:373.6pt;height:249.5pt;z-index:251664384;visibility:visible;mso-wrap-style:square;mso-width-percent:0;mso-height-percent:0;mso-wrap-distance-left:9pt;mso-wrap-distance-top:0;mso-wrap-distance-right:9pt;mso-wrap-distance-bottom:0;mso-position-horizontal:absolute;mso-position-horizontal-relative:margin;mso-position-vertical:absolute;mso-position-vertical-relative:text;mso-width-percent:0;mso-height-percent:0;mso-width-relative:margin;mso-height-relative:margin;v-text-anchor:top" o:gfxdata="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" filled="f" stroked="f" strokeweight=".5pt">
                 <v:textbox>
                   <w:txbxContent>
                     <w:p>
@@ -1320,7 +1384,67 @@
                           <w:rtl/>
                           <w14:ligatures w14:val="none"/>
                         </w:rPr>
-                        <w:t xml:space="preserve"> بالمركز التعليمي بحائل لشطر الطالبات خلال العام الجامعي ١٤٤٧ هـ</w:t>
+                        <w:t xml:space="preserve"> </w:t>
+                      </w:r>
+                      <w:r>
+                        <w:rPr>
+                          <w:rFonts w:ascii="Frutiger LT Arabic 45 Light" w:eastAsia="Times New Roman" w:hAnsi="Frutiger LT Arabic 45 Light" w:cs="Frutiger LT Arabic 45 Light" w:hint="cs"/>
+                          <w:color w:val="156082" w:themeColor="accent1"/>
+                          <w:kern w:val="0"/>
+                          <w:sz w:val="28"/>
+                          <w:szCs w:val="28"/>
+                          <w:rtl/>
+                          <w14:ligatures w14:val="none"/>
+                        </w:rPr>
+                        <w:t>لكلية الحوسبة</w:t>
+                      </w:r>
+                      <w:r>
+                        <w:rPr>
+                          <w:rFonts w:ascii="Frutiger LT Arabic 45 Light" w:eastAsia="Times New Roman" w:hAnsi="Frutiger LT Arabic 45 Light" w:cs="Frutiger LT Arabic 45 Light" w:hint="cs"/>
+                          <w:color w:val="156082" w:themeColor="accent1"/>
+                          <w:kern w:val="0"/>
+                          <w:sz w:val="28"/>
+                          <w:szCs w:val="28"/>
+                          <w:rtl/>
+                          <w14:ligatures w14:val="none"/>
+                        </w:rPr>
+                        <w:t xml:space="preserve"> </w:t>
+                      </w:r>
+                      <w:r>
+                        <w:rPr>
+                          <w:rFonts w:ascii="Frutiger LT Arabic 45 Light" w:eastAsia="Times New Roman" w:hAnsi="Frutiger LT Arabic 45 Light" w:cs="Frutiger LT Arabic 45 Light" w:hint="cs"/>
+                          <w:color w:val="156082" w:themeColor="accent1"/>
+                          <w:kern w:val="0"/>
+                          <w:sz w:val="28"/>
+                          <w:szCs w:val="28"/>
+                          <w:rtl/>
+                          <w14:ligatures w14:val="none"/>
+                        </w:rPr>
+                        <w:t>والمعلوماتية</w:t>
+                      </w:r>
+                      <w:r>
+                        <w:rPr>
+                          <w:rFonts w:ascii="Frutiger LT Arabic 45 Light" w:eastAsia="Times New Roman" w:hAnsi="Frutiger LT Arabic 45 Light" w:cs="Frutiger LT Arabic 45 Light" w:hint="cs"/>
+                          <w:color w:val="156082" w:themeColor="accent1"/>
+                          <w:kern w:val="0"/>
+                          <w:sz w:val="28"/>
+                          <w:szCs w:val="28"/>
+                          <w:rtl/>
+                          <w14:ligatures w14:val="none"/>
+                        </w:rPr>
+                        <w:t xml:space="preserve"> </w:t>
+                      </w:r>
+                      <w:r>
+                        <w:rPr>
+                          <w:rFonts w:ascii="Frutiger LT Arabic 45 Light" w:eastAsia="Times New Roman" w:hAnsi="Frutiger LT Arabic 45 Light" w:cs="Frutiger LT Arabic 45 Light" w:hint="cs"/>
+                          <w:color w:val="156082" w:themeColor="accent1"/>
+                          <w:kern w:val="0"/>
+                          <w:sz w:val="28"/>
+                          <w:szCs w:val="28"/>
+                          <w:rtl/>
+                          <w14:ligatures w14:val="none"/>
+                        </w:rPr>
+                        <w:t>بالمركز التعليمي بحائل لشطر الطالبات خلال العام الجامعي ١٤٤٧ هـ</w:t>
                       </w:r>
                     </w:p>
                     <w:p>
@@ -2541,7 +2665,7 @@
                     <pic:cNvPicPr/>
                   </pic:nvPicPr>
                   <pic:blipFill>
-                    <a:blip r:embed="rId7">
+                    <a:blip r:embed="rId8">
                       <a:extLst>
                         <a:ext uri="{28A0092B-C50C-407E-A947-70E740481C1C}">
                           <a14:useLocalDpi xmlns:a14="http://schemas.microsoft.com/office/drawing/2010/main" val="0"/>
@@ -2578,9 +2702,9 @@
       </w:r>
     </w:p>
     <w:sectPr>
-      <w:footerReference w:type="even" r:id="rId8"/>
-      <w:footerReference w:type="default" r:id="rId9"/>
-      <w:footerReference w:type="first" r:id="rId10"/>
+      <w:footerReference w:type="even" r:id="rId9"/>
+      <w:footerReference w:type="default" r:id="rId10"/>
+      <w:footerReference w:type="first" r:id="rId11"/>
       <w:pgSz w:w="16838" w:h="11906" w:orient="landscape"/>
       <w:pgMar w:top="370" w:right="1440" w:bottom="367" w:left="1440" w:header="720" w:footer="720" w:gutter="0"/>
       <w:cols w:space="720"/>

</xml_diff>

<commit_message>
Remove فرع from Arabic role text
https://claude.ai/code/session_01XbHfH1b8kg1rYEG4wXTtxY
</commit_message>
<xml_diff>
--- a/certificates/أميرة_عبدالله_محمد_بن_رابح.docx
+++ b/certificates/أميرة_عبدالله_محمد_بن_رابح.docx
@@ -1039,7 +1039,7 @@
                                 <w:szCs w:val="28"/>
                                 <w14:ligatures w14:val="none"/>
                               </w:rPr>
-                              <w:t>كمنسقة فرع</w:t>
+                              <w:t>كمنسقة</w:t>
                             </w:r>
                             <w:r>
                               <w:rPr>
@@ -1372,7 +1372,7 @@
                           <w:szCs w:val="28"/>
                           <w14:ligatures w14:val="none"/>
                         </w:rPr>
-                        <w:t>كمنسقة فرع</w:t>
+                        <w:t>كمنسقة</w:t>
                       </w:r>
                       <w:r>
                         <w:rPr>

</xml_diff>

<commit_message>
Remove Branch from English role text
https://claude.ai/code/session_01XbHfH1b8kg1rYEG4wXTtxY
</commit_message>
<xml_diff>
--- a/certificates/أميرة_عبدالله_محمد_بن_رابح.docx
+++ b/certificates/أميرة_عبدالله_محمد_بن_رابح.docx
@@ -1614,7 +1614,7 @@
                                 <w:sz w:val="28"/>
                                 <w:szCs w:val="28"/>
                               </w:rPr>
-                              <w:t>Branch Coordinator of the College of Computing and Informatics</w:t>
+                              <w:t>Coordinator of the College of Computing and Informatics</w:t>
                             </w:r>
                             <w:r>
                               <w:rPr>
@@ -1753,7 +1753,7 @@
                           <w:sz w:val="28"/>
                           <w:szCs w:val="28"/>
                         </w:rPr>
-                        <w:t>Branch Coordinator of the College of Computing and Informatics</w:t>
+                        <w:t>Coordinator of the College of Computing and Informatics</w:t>
                       </w:r>
                       <w:r>
                         <w:rPr>

</xml_diff>